<commit_message>
Ajusta la solucion al MER real de empresa-retail-db
- Esquema, permisos y procedimientos reescritos con las tablas del modelo
  (cliente, canal, campania, interaccion, conversion)
- Se incluye modelo/empresa-retail-bd.mwb
- README y documento tecnico actualizados

Co-Authored-By: Claude Sonnet 5.5 <noreply@anthropic.com>
Claude-Session: https://claude.ai/code/session_012TzeaWNrA7A81qyEVomb7d
</commit_message>
<xml_diff>
--- a/docs/Documento_Tecnico_Empresa_Retail.docx
+++ b/docs/Documento_Tecnico_Empresa_Retail.docx
@@ -35,7 +35,7 @@
           <w:sz w:val="24"/>
           <w:szCs w:val="24"/>
         </w:rPr>
-        <w:t xml:space="preserve">Configuración de la seguridad de la base de datos “empresa_retail”:</w:t>
+        <w:t xml:space="preserve">Configuración de la seguridad de la base de datos “empresa-retail-db”:</w:t>
       </w:r>
     </w:p>
     <w:p>
@@ -166,6 +166,9 @@
     </w:p>
     <w:p>
       <w:pPr>
+        <w:tabs>
+          <w:tab w:val="right" w:pos="9360" w:leader="dot"/>
+        </w:tabs>
         <w:spacing w:after="0" w:before="0" w:line="480"/>
         <w:ind w:left="0"/>
       </w:pPr>
@@ -183,12 +186,15 @@
           <w:sz w:val="24"/>
           <w:szCs w:val="24"/>
         </w:rPr>
-        <w:ptab w:alignment="right" w:relativeTo="margin" w:leader="dot"/>
+        <w:tab/>
         <w:t xml:space="preserve">3</w:t>
       </w:r>
     </w:p>
     <w:p>
       <w:pPr>
+        <w:tabs>
+          <w:tab w:val="right" w:pos="9360" w:leader="dot"/>
+        </w:tabs>
         <w:spacing w:after="0" w:before="0" w:line="480"/>
         <w:ind w:left="0"/>
       </w:pPr>
@@ -206,12 +212,15 @@
           <w:sz w:val="24"/>
           <w:szCs w:val="24"/>
         </w:rPr>
-        <w:ptab w:alignment="right" w:relativeTo="margin" w:leader="dot"/>
+        <w:tab/>
         <w:t xml:space="preserve">3</w:t>
       </w:r>
     </w:p>
     <w:p>
       <w:pPr>
+        <w:tabs>
+          <w:tab w:val="right" w:pos="9360" w:leader="dot"/>
+        </w:tabs>
         <w:spacing w:after="0" w:before="0" w:line="480"/>
         <w:ind w:left="360"/>
       </w:pPr>
@@ -229,12 +238,15 @@
           <w:sz w:val="24"/>
           <w:szCs w:val="24"/>
         </w:rPr>
-        <w:ptab w:alignment="right" w:relativeTo="margin" w:leader="dot"/>
+        <w:tab/>
         <w:t xml:space="preserve">3</w:t>
       </w:r>
     </w:p>
     <w:p>
       <w:pPr>
+        <w:tabs>
+          <w:tab w:val="right" w:pos="9360" w:leader="dot"/>
+        </w:tabs>
         <w:spacing w:after="0" w:before="0" w:line="480"/>
         <w:ind w:left="360"/>
       </w:pPr>
@@ -252,12 +264,15 @@
           <w:sz w:val="24"/>
           <w:szCs w:val="24"/>
         </w:rPr>
-        <w:ptab w:alignment="right" w:relativeTo="margin" w:leader="dot"/>
+        <w:tab/>
         <w:t xml:space="preserve">4</w:t>
       </w:r>
     </w:p>
     <w:p>
       <w:pPr>
+        <w:tabs>
+          <w:tab w:val="right" w:pos="9360" w:leader="dot"/>
+        </w:tabs>
         <w:spacing w:after="0" w:before="0" w:line="480"/>
         <w:ind w:left="360"/>
       </w:pPr>
@@ -275,12 +290,15 @@
           <w:sz w:val="24"/>
           <w:szCs w:val="24"/>
         </w:rPr>
-        <w:ptab w:alignment="right" w:relativeTo="margin" w:leader="dot"/>
+        <w:tab/>
         <w:t xml:space="preserve">5</w:t>
       </w:r>
     </w:p>
     <w:p>
       <w:pPr>
+        <w:tabs>
+          <w:tab w:val="right" w:pos="9360" w:leader="dot"/>
+        </w:tabs>
         <w:spacing w:after="0" w:before="0" w:line="480"/>
         <w:ind w:left="360"/>
       </w:pPr>
@@ -298,12 +316,15 @@
           <w:sz w:val="24"/>
           <w:szCs w:val="24"/>
         </w:rPr>
-        <w:ptab w:alignment="right" w:relativeTo="margin" w:leader="dot"/>
+        <w:tab/>
         <w:t xml:space="preserve">6</w:t>
       </w:r>
     </w:p>
     <w:p>
       <w:pPr>
+        <w:tabs>
+          <w:tab w:val="right" w:pos="9360" w:leader="dot"/>
+        </w:tabs>
         <w:spacing w:after="0" w:before="0" w:line="480"/>
         <w:ind w:left="360"/>
       </w:pPr>
@@ -321,12 +342,15 @@
           <w:sz w:val="24"/>
           <w:szCs w:val="24"/>
         </w:rPr>
-        <w:ptab w:alignment="right" w:relativeTo="margin" w:leader="dot"/>
+        <w:tab/>
         <w:t xml:space="preserve">7</w:t>
       </w:r>
     </w:p>
     <w:p>
       <w:pPr>
+        <w:tabs>
+          <w:tab w:val="right" w:pos="9360" w:leader="dot"/>
+        </w:tabs>
         <w:spacing w:after="0" w:before="0" w:line="480"/>
         <w:ind w:left="360"/>
       </w:pPr>
@@ -344,12 +368,15 @@
           <w:sz w:val="24"/>
           <w:szCs w:val="24"/>
         </w:rPr>
-        <w:ptab w:alignment="right" w:relativeTo="margin" w:leader="dot"/>
-        <w:t xml:space="preserve">7</w:t>
-      </w:r>
-    </w:p>
-    <w:p>
-      <w:pPr>
+        <w:tab/>
+        <w:t xml:space="preserve">8</w:t>
+      </w:r>
+    </w:p>
+    <w:p>
+      <w:pPr>
+        <w:tabs>
+          <w:tab w:val="right" w:pos="9360" w:leader="dot"/>
+        </w:tabs>
         <w:spacing w:after="0" w:before="0" w:line="480"/>
         <w:ind w:left="0"/>
       </w:pPr>
@@ -367,12 +394,15 @@
           <w:sz w:val="24"/>
           <w:szCs w:val="24"/>
         </w:rPr>
-        <w:ptab w:alignment="right" w:relativeTo="margin" w:leader="dot"/>
+        <w:tab/>
         <w:t xml:space="preserve">8</w:t>
       </w:r>
     </w:p>
     <w:p>
       <w:pPr>
+        <w:tabs>
+          <w:tab w:val="right" w:pos="9360" w:leader="dot"/>
+        </w:tabs>
         <w:spacing w:after="0" w:before="0" w:line="480"/>
         <w:ind w:left="0"/>
       </w:pPr>
@@ -390,8 +420,8 @@
           <w:sz w:val="24"/>
           <w:szCs w:val="24"/>
         </w:rPr>
-        <w:ptab w:alignment="right" w:relativeTo="margin" w:leader="dot"/>
-        <w:t xml:space="preserve">9</w:t>
+        <w:tab/>
+        <w:t xml:space="preserve">10</w:t>
       </w:r>
     </w:p>
     <w:p>
@@ -441,7 +471,7 @@
           <w:sz w:val="24"/>
           <w:szCs w:val="24"/>
         </w:rPr>
-        <w:t xml:space="preserve">Este documento describe la configuración de seguridad de la base de datos empresa_retail, implementada en MySQL 8, para separar las responsabilidades de tres perfiles de trabajo: la persona encargada de la atención y gestión de clientes (Cajas), la persona que administra canales y campañas (Inventario y marketing) y la persona de auditoría y gerencia. Para ello se aplica el principio de mínimo privilegio, según el cual cada usuario debe disponer únicamente de los permisos indispensables para cumplir su función (Saltzer &amp; Schroeder, 1975).</w:t>
+        <w:t xml:space="preserve">Este documento describe la configuración de seguridad de la base de datos empresa-retail-db, implementada en MySQL 8, para separar las responsabilidades de tres perfiles de trabajo: la persona encargada de la atención y gestión de clientes (Cajas), la persona que administra canales y campañas (Inventario y marketing) y la persona de auditoría y gerencia. Para ello se aplica el principio de mínimo privilegio, según el cual cada usuario debe disponer únicamente de los permisos indispensables para cumplir su función (Saltzer &amp; Schroeder, 1975).</w:t>
       </w:r>
     </w:p>
     <w:p>
@@ -455,7 +485,7 @@
           <w:sz w:val="24"/>
           <w:szCs w:val="24"/>
         </w:rPr>
-        <w:t xml:space="preserve">El trabajo incluye la creación del repositorio de control de versiones empresa-retail-admin, el diseño del esquema de datos, la definición de roles y usuarios, la asignación de permisos y la creación de procedimientos almacenados de consulta para el rol de auditoría. La solución se encuentra en la rama develop del repositorio.</w:t>
+        <w:t xml:space="preserve">El trabajo incluye la creación del repositorio de control de versiones empresa-retail-admin, la construcción del esquema de datos a partir del modelo entidad-relación suministrado, la definición de roles y usuarios, la asignación de permisos y la creación de procedimientos almacenados de consulta para el rol de auditoría. La solución se encuentra en la rama develop del repositorio.</w:t>
       </w:r>
     </w:p>
     <w:p>
@@ -1116,6 +1146,75 @@
             <w:tcBorders>
               <w:top w:val="none" w:color="FFFFFF" w:sz="0"/>
               <w:left w:val="none" w:color="FFFFFF" w:sz="0"/>
+              <w:bottom w:val="none" w:color="FFFFFF" w:sz="0"/>
+              <w:right w:val="none" w:color="FFFFFF" w:sz="0"/>
+            </w:tcBorders>
+            <w:tcMar>
+              <w:top w:type="dxa" w:w="60"/>
+              <w:left w:type="dxa" w:w="100"/>
+              <w:bottom w:type="dxa" w:w="60"/>
+              <w:right w:type="dxa" w:w="100"/>
+            </w:tcMar>
+          </w:tcPr>
+          <w:p>
+            <w:pPr>
+              <w:spacing w:after="0" w:before="0" w:line="240"/>
+            </w:pPr>
+            <w:r>
+              <w:rPr>
+                <w:rFonts w:ascii="Times New Roman" w:cs="Times New Roman" w:eastAsia="Times New Roman" w:hAnsi="Times New Roman"/>
+                <w:b w:val="false"/>
+                <w:bCs w:val="false"/>
+                <w:sz w:val="22"/>
+                <w:szCs w:val="22"/>
+              </w:rPr>
+              <w:t xml:space="preserve">modelo/empresa-retail-bd.mwb</w:t>
+            </w:r>
+          </w:p>
+        </w:tc>
+        <w:tc>
+          <w:tcPr>
+            <w:tcW w:type="dxa" w:w="6160"/>
+            <w:tcBorders>
+              <w:top w:val="none" w:color="FFFFFF" w:sz="0"/>
+              <w:left w:val="none" w:color="FFFFFF" w:sz="0"/>
+              <w:bottom w:val="none" w:color="FFFFFF" w:sz="0"/>
+              <w:right w:val="none" w:color="FFFFFF" w:sz="0"/>
+            </w:tcBorders>
+            <w:tcMar>
+              <w:top w:type="dxa" w:w="60"/>
+              <w:left w:type="dxa" w:w="100"/>
+              <w:bottom w:type="dxa" w:w="60"/>
+              <w:right w:type="dxa" w:w="100"/>
+            </w:tcMar>
+          </w:tcPr>
+          <w:p>
+            <w:pPr>
+              <w:spacing w:after="0" w:before="0" w:line="240"/>
+            </w:pPr>
+            <w:r>
+              <w:rPr>
+                <w:rFonts w:ascii="Times New Roman" w:cs="Times New Roman" w:eastAsia="Times New Roman" w:hAnsi="Times New Roman"/>
+                <w:b w:val="false"/>
+                <w:bCs w:val="false"/>
+                <w:sz w:val="22"/>
+                <w:szCs w:val="22"/>
+              </w:rPr>
+              <w:t xml:space="preserve">Modelo entidad-relación de MySQL Workbench.</w:t>
+            </w:r>
+          </w:p>
+        </w:tc>
+      </w:tr>
+      <w:tr>
+        <w:trPr>
+          <w:cantSplit/>
+        </w:trPr>
+        <w:tc>
+          <w:tcPr>
+            <w:tcW w:type="dxa" w:w="3200"/>
+            <w:tcBorders>
+              <w:top w:val="none" w:color="FFFFFF" w:sz="0"/>
+              <w:left w:val="none" w:color="FFFFFF" w:sz="0"/>
               <w:bottom w:val="single" w:color="000000" w:sz="6"/>
               <w:right w:val="none" w:color="FFFFFF" w:sz="0"/>
             </w:tcBorders>
@@ -1209,7 +1308,7 @@
           <w:sz w:val="24"/>
           <w:szCs w:val="24"/>
         </w:rPr>
-        <w:t xml:space="preserve">La base de datos empresa_retail se compone de cinco tablas relacionadas: Clientes, Canales, Campanas, Interacciones y Conversiones. Las interacciones registran los contactos entre la empresa y cada cliente a través de un canal; las campañas se ejecutan sobre un canal; y las conversiones (compra, registro o suscripción) asocian a un cliente con la campaña que originó la acción.</w:t>
+        <w:t xml:space="preserve">El esquema se construyó a partir del modelo entidad-relación empresa-retail-bd.mwb, elaborado en MySQL Workbench, que define la base de datos empresa-retail-db con cinco tablas: cliente, canal, campania, interaccion y conversion. Cada campaña pertenece a un canal; cada interacción (clic, visita, comentario o descarga) relaciona a un cliente con una campaña; y cada conversión (compra, registro o suscripción) se asocia a un cliente. Como el nombre de la base de datos contiene guiones, en las sentencias SQL se escribe entre comillas invertidas.</w:t>
       </w:r>
     </w:p>
     <w:p>
@@ -1241,7 +1340,7 @@
           <w:sz w:val="24"/>
           <w:szCs w:val="24"/>
         </w:rPr>
-        <w:t xml:space="preserve">Tablas de la base de datos empresa_retail</w:t>
+        <w:t xml:space="preserve">Tablas de la base de datos empresa-retail-db</w:t>
       </w:r>
     </w:p>
     <w:tbl>
@@ -1361,7 +1460,7 @@
                 <w:sz w:val="22"/>
                 <w:szCs w:val="22"/>
               </w:rPr>
-              <w:t xml:space="preserve">Clientes</w:t>
+              <w:t xml:space="preserve">cliente</w:t>
             </w:r>
           </w:p>
         </w:tc>
@@ -1393,7 +1492,7 @@
                 <w:sz w:val="22"/>
                 <w:szCs w:val="22"/>
               </w:rPr>
-              <w:t xml:space="preserve">Datos personales y de contacto de cada cliente.</w:t>
+              <w:t xml:space="preserve">Datos personales y de contacto de cada cliente; el correo es único.</w:t>
             </w:r>
           </w:p>
         </w:tc>
@@ -1430,7 +1529,7 @@
                 <w:sz w:val="22"/>
                 <w:szCs w:val="22"/>
               </w:rPr>
-              <w:t xml:space="preserve">Canales</w:t>
+              <w:t xml:space="preserve">canal</w:t>
             </w:r>
           </w:p>
         </w:tc>
@@ -1462,7 +1561,7 @@
                 <w:sz w:val="22"/>
                 <w:szCs w:val="22"/>
               </w:rPr>
-              <w:t xml:space="preserve">Medios de contacto: sitio web, redes sociales, correo masivo y tienda física.</w:t>
+              <w:t xml:space="preserve">Canales de marketing: Red Social, Buscador o Email.</w:t>
             </w:r>
           </w:p>
         </w:tc>
@@ -1499,7 +1598,7 @@
                 <w:sz w:val="22"/>
                 <w:szCs w:val="22"/>
               </w:rPr>
-              <w:t xml:space="preserve">Campanas</w:t>
+              <w:t xml:space="preserve">campania</w:t>
             </w:r>
           </w:p>
         </w:tc>
@@ -1531,7 +1630,7 @@
                 <w:sz w:val="22"/>
                 <w:szCs w:val="22"/>
               </w:rPr>
-              <w:t xml:space="preserve">Campañas de marketing con fechas, presupuesto y canal asociado.</w:t>
+              <w:t xml:space="preserve">Campañas con presupuesto y fechas; cada una pertenece a un canal.</w:t>
             </w:r>
           </w:p>
         </w:tc>
@@ -1568,7 +1667,7 @@
                 <w:sz w:val="22"/>
                 <w:szCs w:val="22"/>
               </w:rPr>
-              <w:t xml:space="preserve">Interacciones</w:t>
+              <w:t xml:space="preserve">interaccion</w:t>
             </w:r>
           </w:p>
         </w:tc>
@@ -1600,7 +1699,7 @@
                 <w:sz w:val="22"/>
                 <w:szCs w:val="22"/>
               </w:rPr>
-              <w:t xml:space="preserve">Consultas, reclamos, ventas y seguimientos de cada cliente.</w:t>
+              <w:t xml:space="preserve">Clic, visita, comentario o descarga de un cliente en una campaña.</w:t>
             </w:r>
           </w:p>
         </w:tc>
@@ -1637,7 +1736,7 @@
                 <w:sz w:val="22"/>
                 <w:szCs w:val="22"/>
               </w:rPr>
-              <w:t xml:space="preserve">Conversiones</w:t>
+              <w:t xml:space="preserve">conversion</w:t>
             </w:r>
           </w:p>
         </w:tc>
@@ -1669,7 +1768,7 @@
                 <w:sz w:val="22"/>
                 <w:szCs w:val="22"/>
               </w:rPr>
-              <w:t xml:space="preserve">Compras, registros y suscripciones atribuidos a una campaña.</w:t>
+              <w:t xml:space="preserve">Compra, registro o suscripción de un cliente, con su valor y fecha.</w:t>
             </w:r>
           </w:p>
         </w:tc>
@@ -1691,7 +1790,7 @@
           <w:sz w:val="24"/>
           <w:szCs w:val="24"/>
         </w:rPr>
-        <w:t xml:space="preserve">A continuación se muestra la definición de la tabla Conversiones, sobre la que el rol de auditoría tendrá acceso de lectura:</w:t>
+        <w:t xml:space="preserve">A continuación se muestra la definición de la tabla conversion, sobre la que el rol de auditoría tendrá acceso de lectura. En el modelo los valores monetarios no traían precisión definida (DECIMAL sin parámetros equivale a cero decimales), por lo que se fijó DECIMAL(12,2) en con_valor y cam_presupuesto:</w:t>
       </w:r>
     </w:p>
     <w:p>
@@ -1707,7 +1806,7 @@
           <w:sz w:val="19"/>
           <w:szCs w:val="19"/>
         </w:rPr>
-        <w:t xml:space="preserve">CREATE TABLE Conversiones (</w:t>
+        <w:t xml:space="preserve">CREATE TABLE conversion (</w:t>
       </w:r>
     </w:p>
     <w:p>
@@ -1723,7 +1822,7 @@
           <w:sz w:val="19"/>
           <w:szCs w:val="19"/>
         </w:rPr>
-        <w:t xml:space="preserve">    id_conversion   INT AUTO_INCREMENT PRIMARY KEY,</w:t>
+        <w:t xml:space="preserve">    con_id_conversion       INT           NOT NULL AUTO_INCREMENT,</w:t>
       </w:r>
     </w:p>
     <w:p>
@@ -1739,7 +1838,7 @@
           <w:sz w:val="19"/>
           <w:szCs w:val="19"/>
         </w:rPr>
-        <w:t xml:space="preserve">    id_cliente      INT NOT NULL,</w:t>
+        <w:t xml:space="preserve">    con_tipo                ENUM('compra','registro',</w:t>
       </w:r>
     </w:p>
     <w:p>
@@ -1755,7 +1854,7 @@
           <w:sz w:val="19"/>
           <w:szCs w:val="19"/>
         </w:rPr>
-        <w:t xml:space="preserve">    id_campana      INT NOT NULL,</w:t>
+        <w:t xml:space="preserve">                                 'suscripcion') NOT NULL,</w:t>
       </w:r>
     </w:p>
     <w:p>
@@ -1771,7 +1870,7 @@
           <w:sz w:val="19"/>
           <w:szCs w:val="19"/>
         </w:rPr>
-        <w:t xml:space="preserve">    tipo            ENUM('compra','registro','suscripcion') NOT NULL,</w:t>
+        <w:t xml:space="preserve">    con_valor               DECIMAL(12,2) NOT NULL,</w:t>
       </w:r>
     </w:p>
     <w:p>
@@ -1787,7 +1886,7 @@
           <w:sz w:val="19"/>
           <w:szCs w:val="19"/>
         </w:rPr>
-        <w:t xml:space="preserve">    valor           DECIMAL(12,2) NOT NULL DEFAULT 0,</w:t>
+        <w:t xml:space="preserve">    con_fecha               DATE          NOT NULL,</w:t>
       </w:r>
     </w:p>
     <w:p>
@@ -1803,7 +1902,7 @@
           <w:sz w:val="19"/>
           <w:szCs w:val="19"/>
         </w:rPr>
-        <w:t xml:space="preserve">    fecha           DATE NOT NULL,</w:t>
+        <w:t xml:space="preserve">    cliente_cli_id_cliente  INT           NOT NULL,</w:t>
       </w:r>
     </w:p>
     <w:p>
@@ -1819,7 +1918,7 @@
           <w:sz w:val="19"/>
           <w:szCs w:val="19"/>
         </w:rPr>
-        <w:t xml:space="preserve">    CONSTRAINT fk_conv_cliente</w:t>
+        <w:t xml:space="preserve">    PRIMARY KEY (con_id_conversion),</w:t>
       </w:r>
     </w:p>
     <w:p>
@@ -1835,7 +1934,7 @@
           <w:sz w:val="19"/>
           <w:szCs w:val="19"/>
         </w:rPr>
-        <w:t xml:space="preserve">        FOREIGN KEY (id_cliente) REFERENCES Clientes (id_cliente),</w:t>
+        <w:t xml:space="preserve">    CONSTRAINT fk_conversacion_cliente1</w:t>
       </w:r>
     </w:p>
     <w:p>
@@ -1851,7 +1950,7 @@
           <w:sz w:val="19"/>
           <w:szCs w:val="19"/>
         </w:rPr>
-        <w:t xml:space="preserve">    CONSTRAINT fk_conv_campana</w:t>
+        <w:t xml:space="preserve">        FOREIGN KEY (cliente_cli_id_cliente)</w:t>
       </w:r>
     </w:p>
     <w:p>
@@ -1867,7 +1966,7 @@
           <w:sz w:val="19"/>
           <w:szCs w:val="19"/>
         </w:rPr>
-        <w:t xml:space="preserve">        FOREIGN KEY (id_campana) REFERENCES Campanas (id_campana)</w:t>
+        <w:t xml:space="preserve">        REFERENCES cliente (cli_id_cliente)</w:t>
       </w:r>
     </w:p>
     <w:p>
@@ -2882,7 +2981,7 @@
           <w:sz w:val="24"/>
           <w:szCs w:val="24"/>
         </w:rPr>
-        <w:t xml:space="preserve">Ana gestiona Clientes e Interacciones con permisos de lectura y escritura (SELECT, INSERT y UPDATE). Como cada interacción se registra a través de un canal, también se le concedió lectura sobre Canales.</w:t>
+        <w:t xml:space="preserve">Ana gestiona Clientes e Interacciones con permisos de lectura y escritura (SELECT, INSERT y UPDATE). No recibe acceso a ninguna otra tabla.</w:t>
       </w:r>
     </w:p>
     <w:p>
@@ -2898,7 +2997,7 @@
           <w:sz w:val="19"/>
           <w:szCs w:val="19"/>
         </w:rPr>
-        <w:t xml:space="preserve">GRANT SELECT, INSERT, UPDATE ON empresa_retail.Clientes      TO 'rol_ana';</w:t>
+        <w:t xml:space="preserve">GRANT SELECT, INSERT, UPDATE ON `empresa-retail-db`.cliente</w:t>
       </w:r>
     </w:p>
     <w:p>
@@ -2914,7 +3013,23 @@
           <w:sz w:val="19"/>
           <w:szCs w:val="19"/>
         </w:rPr>
-        <w:t xml:space="preserve">GRANT SELECT, INSERT, UPDATE ON empresa_retail.Interacciones TO 'rol_ana';</w:t>
+        <w:t xml:space="preserve">    TO 'rol_ana';</w:t>
+      </w:r>
+    </w:p>
+    <w:p>
+      <w:pPr>
+        <w:keepLines/>
+        <w:shd w:fill="F2F2F2" w:color="auto" w:val="clear"/>
+        <w:spacing w:after="0" w:before="0" w:line="240"/>
+        <w:ind w:left="360" w:right="360"/>
+      </w:pPr>
+      <w:r>
+        <w:rPr>
+          <w:rFonts w:ascii="Courier New" w:cs="Courier New" w:eastAsia="Courier New" w:hAnsi="Courier New"/>
+          <w:sz w:val="19"/>
+          <w:szCs w:val="19"/>
+        </w:rPr>
+        <w:t xml:space="preserve">GRANT SELECT, INSERT, UPDATE ON `empresa-retail-db`.interaccion</w:t>
       </w:r>
     </w:p>
     <w:p>
@@ -2930,7 +3045,7 @@
           <w:sz w:val="19"/>
           <w:szCs w:val="19"/>
         </w:rPr>
-        <w:t xml:space="preserve">GRANT SELECT                 ON empresa_retail.Canales       TO 'rol_ana';</w:t>
+        <w:t xml:space="preserve">    TO 'rol_ana';</w:t>
       </w:r>
     </w:p>
     <w:p>
@@ -2963,7 +3078,7 @@
           <w:sz w:val="24"/>
           <w:szCs w:val="24"/>
         </w:rPr>
-        <w:t xml:space="preserve">Pedro gestiona Canales y Campañas con lectura y escritura, pero solo puede consultar Clientes: no recibe INSERT ni UPDATE sobre esa tabla, por lo que cualquier intento de modificarla es rechazado por el servidor.</w:t>
+        <w:t xml:space="preserve">Pedro gestiona Canales y Campañas (tablas canal y campania) con lectura y escritura, pero solo puede consultar Clientes: no recibe INSERT ni UPDATE sobre esa tabla, por lo que cualquier intento de modificarla es rechazado por el servidor.</w:t>
       </w:r>
     </w:p>
     <w:p>
@@ -2979,7 +3094,7 @@
           <w:sz w:val="19"/>
           <w:szCs w:val="19"/>
         </w:rPr>
-        <w:t xml:space="preserve">GRANT SELECT, INSERT, UPDATE ON empresa_retail.Canales  TO 'rol_pedro';</w:t>
+        <w:t xml:space="preserve">GRANT SELECT, INSERT, UPDATE ON `empresa-retail-db`.canal</w:t>
       </w:r>
     </w:p>
     <w:p>
@@ -2995,7 +3110,55 @@
           <w:sz w:val="19"/>
           <w:szCs w:val="19"/>
         </w:rPr>
-        <w:t xml:space="preserve">GRANT SELECT, INSERT, UPDATE ON empresa_retail.Campanas TO 'rol_pedro';</w:t>
+        <w:t xml:space="preserve">    TO 'rol_pedro';</w:t>
+      </w:r>
+    </w:p>
+    <w:p>
+      <w:pPr>
+        <w:keepLines/>
+        <w:shd w:fill="F2F2F2" w:color="auto" w:val="clear"/>
+        <w:spacing w:after="0" w:before="0" w:line="240"/>
+        <w:ind w:left="360" w:right="360"/>
+      </w:pPr>
+      <w:r>
+        <w:rPr>
+          <w:rFonts w:ascii="Courier New" w:cs="Courier New" w:eastAsia="Courier New" w:hAnsi="Courier New"/>
+          <w:sz w:val="19"/>
+          <w:szCs w:val="19"/>
+        </w:rPr>
+        <w:t xml:space="preserve">GRANT SELECT, INSERT, UPDATE ON `empresa-retail-db`.campania</w:t>
+      </w:r>
+    </w:p>
+    <w:p>
+      <w:pPr>
+        <w:keepLines/>
+        <w:shd w:fill="F2F2F2" w:color="auto" w:val="clear"/>
+        <w:spacing w:after="0" w:before="0" w:line="240"/>
+        <w:ind w:left="360" w:right="360"/>
+      </w:pPr>
+      <w:r>
+        <w:rPr>
+          <w:rFonts w:ascii="Courier New" w:cs="Courier New" w:eastAsia="Courier New" w:hAnsi="Courier New"/>
+          <w:sz w:val="19"/>
+          <w:szCs w:val="19"/>
+        </w:rPr>
+        <w:t xml:space="preserve">    TO 'rol_pedro';</w:t>
+      </w:r>
+    </w:p>
+    <w:p>
+      <w:pPr>
+        <w:keepLines/>
+        <w:shd w:fill="F2F2F2" w:color="auto" w:val="clear"/>
+        <w:spacing w:after="0" w:before="0" w:line="240"/>
+        <w:ind w:left="360" w:right="360"/>
+      </w:pPr>
+      <w:r>
+        <w:rPr>
+          <w:rFonts w:ascii="Courier New" w:cs="Courier New" w:eastAsia="Courier New" w:hAnsi="Courier New"/>
+          <w:sz w:val="19"/>
+          <w:szCs w:val="19"/>
+        </w:rPr>
+        <w:t xml:space="preserve">GRANT SELECT ON `empresa-retail-db`.cliente</w:t>
       </w:r>
     </w:p>
     <w:p>
@@ -3011,7 +3174,7 @@
           <w:sz w:val="19"/>
           <w:szCs w:val="19"/>
         </w:rPr>
-        <w:t xml:space="preserve">GRANT SELECT                 ON empresa_retail.Clientes TO 'rol_pedro';</w:t>
+        <w:t xml:space="preserve">    TO 'rol_pedro';</w:t>
       </w:r>
     </w:p>
     <w:p>
@@ -3044,14 +3207,14 @@
           <w:sz w:val="24"/>
           <w:szCs w:val="24"/>
         </w:rPr>
-        <w:t xml:space="preserve">Marta solo puede consultar Conversiones (compras, registros y suscripciones) y ejecutar los procedimientos almacenados de consulta. No tiene acceso a ninguna otra tabla ni permisos de escritura.</w:t>
+        <w:t xml:space="preserve">Marta solo puede consultar la tabla conversion (compras, registros y suscripciones) y ejecutar los procedimientos almacenados de consulta. No tiene acceso a ninguna otra tabla ni permisos de escritura.</w:t>
       </w:r>
     </w:p>
     <w:p>
       <w:pPr>
         <w:keepLines/>
         <w:shd w:fill="F2F2F2" w:color="auto" w:val="clear"/>
-        <w:spacing w:after="240" w:before="120" w:line="240"/>
+        <w:spacing w:after="0" w:before="120" w:line="240"/>
         <w:ind w:left="360" w:right="360"/>
       </w:pPr>
       <w:r>
@@ -3060,7 +3223,23 @@
           <w:sz w:val="19"/>
           <w:szCs w:val="19"/>
         </w:rPr>
-        <w:t xml:space="preserve">GRANT SELECT ON empresa_retail.Conversiones TO 'rol_marta';</w:t>
+        <w:t xml:space="preserve">GRANT SELECT ON `empresa-retail-db`.conversion</w:t>
+      </w:r>
+    </w:p>
+    <w:p>
+      <w:pPr>
+        <w:keepLines/>
+        <w:shd w:fill="F2F2F2" w:color="auto" w:val="clear"/>
+        <w:spacing w:after="240" w:before="0" w:line="240"/>
+        <w:ind w:left="360" w:right="360"/>
+      </w:pPr>
+      <w:r>
+        <w:rPr>
+          <w:rFonts w:ascii="Courier New" w:cs="Courier New" w:eastAsia="Courier New" w:hAnsi="Courier New"/>
+          <w:sz w:val="19"/>
+          <w:szCs w:val="19"/>
+        </w:rPr>
+        <w:t xml:space="preserve">    TO 'rol_marta';</w:t>
       </w:r>
     </w:p>
     <w:p>
@@ -3311,7 +3490,7 @@
                 <w:sz w:val="22"/>
                 <w:szCs w:val="22"/>
               </w:rPr>
-              <w:t xml:space="preserve">Clientes</w:t>
+              <w:t xml:space="preserve">cliente</w:t>
             </w:r>
           </w:p>
         </w:tc>
@@ -3476,7 +3655,7 @@
                 <w:sz w:val="22"/>
                 <w:szCs w:val="22"/>
               </w:rPr>
-              <w:t xml:space="preserve">Interacciones</w:t>
+              <w:t xml:space="preserve">interaccion</w:t>
             </w:r>
           </w:p>
         </w:tc>
@@ -3641,7 +3820,7 @@
                 <w:sz w:val="22"/>
                 <w:szCs w:val="22"/>
               </w:rPr>
-              <w:t xml:space="preserve">Canales</w:t>
+              <w:t xml:space="preserve">canal</w:t>
             </w:r>
           </w:p>
         </w:tc>
@@ -3673,7 +3852,7 @@
                 <w:sz w:val="22"/>
                 <w:szCs w:val="22"/>
               </w:rPr>
-              <w:t xml:space="preserve">S</w:t>
+              <w:t xml:space="preserve">—</w:t>
             </w:r>
           </w:p>
         </w:tc>
@@ -3806,7 +3985,7 @@
                 <w:sz w:val="22"/>
                 <w:szCs w:val="22"/>
               </w:rPr>
-              <w:t xml:space="preserve">Campanas</w:t>
+              <w:t xml:space="preserve">campania</w:t>
             </w:r>
           </w:p>
         </w:tc>
@@ -3971,7 +4150,7 @@
                 <w:sz w:val="22"/>
                 <w:szCs w:val="22"/>
               </w:rPr>
-              <w:t xml:space="preserve">Conversiones</w:t>
+              <w:t xml:space="preserve">conversion</w:t>
             </w:r>
           </w:p>
         </w:tc>
@@ -4303,7 +4482,7 @@
           <w:sz w:val="24"/>
           <w:szCs w:val="24"/>
         </w:rPr>
-        <w:t xml:space="preserve">Para el rol de auditoría se crearon tres procedimientos de solo lectura: sp_conversiones_por_tipo, sp_conversiones_por_rango y sp_resumen_conversiones_campana. Se definieron con SQL SECURITY DEFINER y la característica READS SQL DATA, de forma que se ejecutan con los privilegios de la cuenta que los creó y únicamente leen datos. Con ello, la persona de auditoría solo necesita el privilegio EXECUTE para usarlos (Oracle Corporation, s. f.-c). Además de ofrecer reportes listos, los procedimientos encapsulan las consultas y reducen el riesgo de consultas improvisadas.</w:t>
+        <w:t xml:space="preserve">Para el rol de auditoría se crearon tres procedimientos de solo lectura: sp_conversiones_por_tipo, sp_conversiones_por_rango y sp_resumen_conversiones_mensual. Se definieron con SQL SECURITY DEFINER y la característica READS SQL DATA, de forma que se ejecutan con los privilegios de la cuenta que los creó y únicamente leen datos. Con ello, la persona de auditoría solo necesita el privilegio EXECUTE para usarlos (Oracle Corporation, s. f.-c). Además de ofrecer reportes listos, los procedimientos encapsulan las consultas y reducen el riesgo de consultas improvisadas.</w:t>
       </w:r>
     </w:p>
     <w:p>
@@ -4383,7 +4562,7 @@
           <w:sz w:val="19"/>
           <w:szCs w:val="19"/>
         </w:rPr>
-        <w:t xml:space="preserve">    SELECT tipo, COUNT(*) AS cantidad, SUM(valor) AS valor_total</w:t>
+        <w:t xml:space="preserve">    SELECT con_tipo AS tipo, COUNT(*) AS cantidad,</w:t>
       </w:r>
     </w:p>
     <w:p>
@@ -4399,7 +4578,7 @@
           <w:sz w:val="19"/>
           <w:szCs w:val="19"/>
         </w:rPr>
-        <w:t xml:space="preserve">    FROM Conversiones</w:t>
+        <w:t xml:space="preserve">           SUM(con_valor) AS valor_total</w:t>
       </w:r>
     </w:p>
     <w:p>
@@ -4415,7 +4594,7 @@
           <w:sz w:val="19"/>
           <w:szCs w:val="19"/>
         </w:rPr>
-        <w:t xml:space="preserve">    GROUP BY tipo</w:t>
+        <w:t xml:space="preserve">    FROM conversion</w:t>
       </w:r>
     </w:p>
     <w:p>
@@ -4431,7 +4610,7 @@
           <w:sz w:val="19"/>
           <w:szCs w:val="19"/>
         </w:rPr>
-        <w:t xml:space="preserve">    ORDER BY cantidad DESC;</w:t>
+        <w:t xml:space="preserve">    GROUP BY con_tipo</w:t>
       </w:r>
     </w:p>
     <w:p>
@@ -4447,7 +4626,7 @@
           <w:sz w:val="19"/>
           <w:szCs w:val="19"/>
         </w:rPr>
-        <w:t xml:space="preserve">END;</w:t>
+        <w:t xml:space="preserve">    ORDER BY cantidad DESC;</w:t>
       </w:r>
     </w:p>
     <w:p>
@@ -4463,7 +4642,7 @@
           <w:sz w:val="19"/>
           <w:szCs w:val="19"/>
         </w:rPr>
-        <w:t xml:space="preserve"> </w:t>
+        <w:t xml:space="preserve">END;</w:t>
       </w:r>
     </w:p>
     <w:p>
@@ -4479,7 +4658,39 @@
           <w:sz w:val="19"/>
           <w:szCs w:val="19"/>
         </w:rPr>
-        <w:t xml:space="preserve">GRANT EXECUTE ON PROCEDURE empresa_retail.sp_conversiones_por_tipo</w:t>
+        <w:t xml:space="preserve"> </w:t>
+      </w:r>
+    </w:p>
+    <w:p>
+      <w:pPr>
+        <w:keepLines/>
+        <w:shd w:fill="F2F2F2" w:color="auto" w:val="clear"/>
+        <w:spacing w:after="0" w:before="0" w:line="240"/>
+        <w:ind w:left="360" w:right="360"/>
+      </w:pPr>
+      <w:r>
+        <w:rPr>
+          <w:rFonts w:ascii="Courier New" w:cs="Courier New" w:eastAsia="Courier New" w:hAnsi="Courier New"/>
+          <w:sz w:val="19"/>
+          <w:szCs w:val="19"/>
+        </w:rPr>
+        <w:t xml:space="preserve">GRANT EXECUTE ON PROCEDURE</w:t>
+      </w:r>
+    </w:p>
+    <w:p>
+      <w:pPr>
+        <w:keepLines/>
+        <w:shd w:fill="F2F2F2" w:color="auto" w:val="clear"/>
+        <w:spacing w:after="0" w:before="0" w:line="240"/>
+        <w:ind w:left="360" w:right="360"/>
+      </w:pPr>
+      <w:r>
+        <w:rPr>
+          <w:rFonts w:ascii="Courier New" w:cs="Courier New" w:eastAsia="Courier New" w:hAnsi="Courier New"/>
+          <w:sz w:val="19"/>
+          <w:szCs w:val="19"/>
+        </w:rPr>
+        <w:t xml:space="preserve">    `empresa-retail-db`.sp_conversiones_por_tipo</w:t>
       </w:r>
     </w:p>
     <w:p>
@@ -4743,7 +4954,7 @@
                 <w:sz w:val="22"/>
                 <w:szCs w:val="22"/>
               </w:rPr>
-              <w:t xml:space="preserve">UPDATE sobre Clientes</w:t>
+              <w:t xml:space="preserve">UPDATE sobre cliente</w:t>
             </w:r>
           </w:p>
         </w:tc>
@@ -4844,7 +5055,7 @@
                 <w:sz w:val="22"/>
                 <w:szCs w:val="22"/>
               </w:rPr>
-              <w:t xml:space="preserve">SELECT sobre Campanas</w:t>
+              <w:t xml:space="preserve">SELECT sobre campania</w:t>
             </w:r>
           </w:p>
         </w:tc>
@@ -4945,7 +5156,7 @@
                 <w:sz w:val="22"/>
                 <w:szCs w:val="22"/>
               </w:rPr>
-              <w:t xml:space="preserve">DELETE sobre Clientes</w:t>
+              <w:t xml:space="preserve">DELETE sobre cliente</w:t>
             </w:r>
           </w:p>
         </w:tc>
@@ -5046,7 +5257,7 @@
                 <w:sz w:val="22"/>
                 <w:szCs w:val="22"/>
               </w:rPr>
-              <w:t xml:space="preserve">SELECT sobre Clientes</w:t>
+              <w:t xml:space="preserve">SELECT sobre cliente</w:t>
             </w:r>
           </w:p>
         </w:tc>
@@ -5147,7 +5358,7 @@
                 <w:sz w:val="22"/>
                 <w:szCs w:val="22"/>
               </w:rPr>
-              <w:t xml:space="preserve">UPDATE sobre Clientes</w:t>
+              <w:t xml:space="preserve">UPDATE sobre cliente</w:t>
             </w:r>
           </w:p>
         </w:tc>
@@ -5248,7 +5459,7 @@
                 <w:sz w:val="22"/>
                 <w:szCs w:val="22"/>
               </w:rPr>
-              <w:t xml:space="preserve">INSERT sobre Campanas</w:t>
+              <w:t xml:space="preserve">INSERT sobre campania</w:t>
             </w:r>
           </w:p>
         </w:tc>
@@ -5349,7 +5560,7 @@
                 <w:sz w:val="22"/>
                 <w:szCs w:val="22"/>
               </w:rPr>
-              <w:t xml:space="preserve">SELECT sobre Conversiones</w:t>
+              <w:t xml:space="preserve">SELECT sobre conversion</w:t>
             </w:r>
           </w:p>
         </w:tc>
@@ -5551,7 +5762,7 @@
                 <w:sz w:val="22"/>
                 <w:szCs w:val="22"/>
               </w:rPr>
-              <w:t xml:space="preserve">SELECT sobre Clientes</w:t>
+              <w:t xml:space="preserve">SELECT sobre cliente</w:t>
             </w:r>
           </w:p>
         </w:tc>
@@ -5652,7 +5863,7 @@
                 <w:sz w:val="22"/>
                 <w:szCs w:val="22"/>
               </w:rPr>
-              <w:t xml:space="preserve">INSERT sobre Conversiones</w:t>
+              <w:t xml:space="preserve">INSERT sobre conversion</w:t>
             </w:r>
           </w:p>
         </w:tc>

</xml_diff>

<commit_message>
Integra datos de prueba del sector agropecuario
- 01_esquema.sql reemplaza los datos de ejemplo por los datos reales
  (4 canales, 29 campanias, 25 clientes, 24 interacciones, 13 conversiones)
- Se regenera 00_instalar_todo.sql
- Documento tecnico actualizado

Co-Authored-By: Claude Sonnet 5.5 <noreply@anthropic.com>
Claude-Session: https://claude.ai/code/session_012TzeaWNrA7A81qyEVomb7d
</commit_message>
<xml_diff>
--- a/docs/Documento_Tecnico_Empresa_Retail.docx
+++ b/docs/Documento_Tecnico_Empresa_Retail.docx
@@ -395,7 +395,7 @@
           <w:szCs w:val="24"/>
         </w:rPr>
         <w:tab/>
-        <w:t xml:space="preserve">8</w:t>
+        <w:t xml:space="preserve">9</w:t>
       </w:r>
     </w:p>
     <w:p>
@@ -1778,6 +1778,20 @@
       <w:pPr>
         <w:spacing w:after="0" w:before="0" w:line="480"/>
       </w:pPr>
+    </w:p>
+    <w:p>
+      <w:pPr>
+        <w:spacing w:after="0" w:before="0" w:line="480"/>
+        <w:ind w:firstLine="720"/>
+      </w:pPr>
+      <w:r>
+        <w:rPr>
+          <w:rFonts w:ascii="Times New Roman" w:cs="Times New Roman" w:eastAsia="Times New Roman" w:hAnsi="Times New Roman"/>
+          <w:sz w:val="24"/>
+          <w:szCs w:val="24"/>
+        </w:rPr>
+        <w:t xml:space="preserve">Para las pruebas se cargaron datos del sector agropecuario: 4 canales, 29 campañas, 25 clientes, 24 interacciones y 13 conversiones. Los datos respetan todas las llaves foráneas del modelo y los valores permitidos de cada tipo.</w:t>
+      </w:r>
     </w:p>
     <w:p>
       <w:pPr>

</xml_diff>

<commit_message>
Agrega resultados de las pruebas con cada usuario
- Capturas de ana_crm, pedro_mkt y marta_auditoria en docs/evidencias
- Documento tecnico con la seccion Resultados de las pruebas (Figuras 1-3)
- Tabla 5 y conclusion actualizadas

Co-Authored-By: Claude Sonnet 5.5 <noreply@anthropic.com>
Claude-Session: https://claude.ai/code/session_012TzeaWNrA7A81qyEVomb7d
</commit_message>
<xml_diff>
--- a/docs/Documento_Tecnico_Empresa_Retail.docx
+++ b/docs/Documento_Tecnico_Empresa_Retail.docx
@@ -378,15 +378,15 @@
           <w:tab w:val="right" w:pos="9360" w:leader="dot"/>
         </w:tabs>
         <w:spacing w:after="0" w:before="0" w:line="480"/>
-        <w:ind w:left="0"/>
-      </w:pPr>
-      <w:r>
-        <w:rPr>
-          <w:rFonts w:ascii="Times New Roman" w:cs="Times New Roman" w:eastAsia="Times New Roman" w:hAnsi="Times New Roman"/>
-          <w:sz w:val="24"/>
-          <w:szCs w:val="24"/>
-        </w:rPr>
-        <w:t xml:space="preserve">Conclusión</w:t>
+        <w:ind w:left="360"/>
+      </w:pPr>
+      <w:r>
+        <w:rPr>
+          <w:rFonts w:ascii="Times New Roman" w:cs="Times New Roman" w:eastAsia="Times New Roman" w:hAnsi="Times New Roman"/>
+          <w:sz w:val="24"/>
+          <w:szCs w:val="24"/>
+        </w:rPr>
+        <w:t xml:space="preserve">Resultados de las pruebas</w:t>
       </w:r>
       <w:r>
         <w:rPr>
@@ -412,6 +412,32 @@
           <w:sz w:val="24"/>
           <w:szCs w:val="24"/>
         </w:rPr>
+        <w:t xml:space="preserve">Conclusión</w:t>
+      </w:r>
+      <w:r>
+        <w:rPr>
+          <w:rFonts w:ascii="Times New Roman" w:cs="Times New Roman" w:eastAsia="Times New Roman" w:hAnsi="Times New Roman"/>
+          <w:sz w:val="24"/>
+          <w:szCs w:val="24"/>
+        </w:rPr>
+        <w:tab/>
+        <w:t xml:space="preserve">11</w:t>
+      </w:r>
+    </w:p>
+    <w:p>
+      <w:pPr>
+        <w:tabs>
+          <w:tab w:val="right" w:pos="9360" w:leader="dot"/>
+        </w:tabs>
+        <w:spacing w:after="0" w:before="0" w:line="480"/>
+        <w:ind w:left="0"/>
+      </w:pPr>
+      <w:r>
+        <w:rPr>
+          <w:rFonts w:ascii="Times New Roman" w:cs="Times New Roman" w:eastAsia="Times New Roman" w:hAnsi="Times New Roman"/>
+          <w:sz w:val="24"/>
+          <w:szCs w:val="24"/>
+        </w:rPr>
         <w:t xml:space="preserve">Referencias</w:t>
       </w:r>
       <w:r>
@@ -421,7 +447,7 @@
           <w:szCs w:val="24"/>
         </w:rPr>
         <w:tab/>
-        <w:t xml:space="preserve">10</w:t>
+        <w:t xml:space="preserve">13</w:t>
       </w:r>
     </w:p>
     <w:p>
@@ -4751,7 +4777,7 @@
           <w:sz w:val="24"/>
           <w:szCs w:val="24"/>
         </w:rPr>
-        <w:t xml:space="preserve">Para comprobar la configuración se utiliza SHOW GRANTS, que lista los privilegios efectivos de cada rol y de cada cuenta, y se realizan pruebas iniciando sesión con cada usuario. La Tabla 5 resume los resultados esperados; el archivo sql/05_verificacion.sql contiene las sentencias completas.</w:t>
+        <w:t xml:space="preserve">Para comprobar la configuración se utiliza SHOW GRANTS, que lista los privilegios efectivos de cada rol y de cada cuenta, y se realizan pruebas iniciando sesión con cada usuario. La Tabla 5 resume los resultados esperados, el archivo sql/05_verificacion.sql contiene las sentencias completas y la sección siguiente presenta los resultados obtenidos.</w:t>
       </w:r>
     </w:p>
     <w:p>
@@ -5473,7 +5499,7 @@
                 <w:sz w:val="22"/>
                 <w:szCs w:val="22"/>
               </w:rPr>
-              <w:t xml:space="preserve">INSERT sobre campania</w:t>
+              <w:t xml:space="preserve">UPDATE sobre campania</w:t>
             </w:r>
           </w:p>
         </w:tc>
@@ -5922,9 +5948,9 @@
     </w:p>
     <w:p>
       <w:pPr>
-        <w:pStyle w:val="Heading1"/>
-        <w:spacing w:after="0" w:before="0" w:line="480"/>
-        <w:jc w:val="center"/>
+        <w:pStyle w:val="Heading2"/>
+        <w:spacing w:after="0" w:before="0" w:line="480"/>
+        <w:jc w:val="left"/>
       </w:pPr>
       <w:r>
         <w:rPr>
@@ -5934,6 +5960,385 @@
           <w:sz w:val="24"/>
           <w:szCs w:val="24"/>
         </w:rPr>
+        <w:t xml:space="preserve">Resultados de las pruebas</w:t>
+      </w:r>
+    </w:p>
+    <w:p>
+      <w:pPr>
+        <w:spacing w:after="0" w:before="0" w:line="480"/>
+        <w:ind w:firstLine="720"/>
+      </w:pPr>
+      <w:r>
+        <w:rPr>
+          <w:rFonts w:ascii="Times New Roman" w:cs="Times New Roman" w:eastAsia="Times New Roman" w:hAnsi="Times New Roman"/>
+          <w:sz w:val="24"/>
+          <w:szCs w:val="24"/>
+        </w:rPr>
+        <w:t xml:space="preserve">Las pruebas se ejecutaron desde la terminal de MySQL, iniciando sesión con cada usuario mediante el comando mysql -u seguido del nombre de la cuenta. En cada sesión se consultó primero CURRENT_USER() para confirmar con qué cuenta se estaba trabajando. Para probar la escritura sin alterar datos se usó una actualización que asigna a una columna su mismo valor.</w:t>
+      </w:r>
+    </w:p>
+    <w:p>
+      <w:pPr>
+        <w:spacing w:after="0" w:before="0" w:line="480"/>
+        <w:ind w:firstLine="720"/>
+      </w:pPr>
+      <w:r>
+        <w:rPr>
+          <w:rFonts w:ascii="Times New Roman" w:cs="Times New Roman" w:eastAsia="Times New Roman" w:hAnsi="Times New Roman"/>
+          <w:sz w:val="24"/>
+          <w:szCs w:val="24"/>
+        </w:rPr>
+        <w:t xml:space="preserve">La Figura 1 muestra la sesión de ana_crm. Puede leer y actualizar la tabla cliente, pero el servidor rechaza con el error 1142 tanto la lectura de la tabla campania como el borrado de registros de cliente, porque su rol no incluye esos privilegios.</w:t>
+      </w:r>
+    </w:p>
+    <w:p>
+      <w:pPr>
+        <w:keepNext/>
+        <w:spacing w:after="0" w:before="240" w:line="240"/>
+      </w:pPr>
+      <w:r>
+        <w:rPr>
+          <w:rFonts w:ascii="Times New Roman" w:cs="Times New Roman" w:eastAsia="Times New Roman" w:hAnsi="Times New Roman"/>
+          <w:b/>
+          <w:bCs/>
+          <w:sz w:val="24"/>
+          <w:szCs w:val="24"/>
+        </w:rPr>
+        <w:t xml:space="preserve">Figura 1</w:t>
+      </w:r>
+    </w:p>
+    <w:p>
+      <w:pPr>
+        <w:keepNext/>
+        <w:spacing w:after="120" w:before="0" w:line="240"/>
+      </w:pPr>
+      <w:r>
+        <w:rPr>
+          <w:rFonts w:ascii="Times New Roman" w:cs="Times New Roman" w:eastAsia="Times New Roman" w:hAnsi="Times New Roman"/>
+          <w:i/>
+          <w:iCs/>
+          <w:sz w:val="24"/>
+          <w:szCs w:val="24"/>
+        </w:rPr>
+        <w:t xml:space="preserve">Pruebas de permisos con el usuario ana_crm</w:t>
+      </w:r>
+    </w:p>
+    <w:p>
+      <w:pPr>
+        <w:keepNext/>
+        <w:spacing w:after="120" w:before="0" w:line="240" w:lineRule="auto"/>
+        <w:jc w:val="center"/>
+      </w:pPr>
+      <w:r>
+        <w:drawing>
+          <wp:inline distT="0" distB="0" distL="0" distR="0">
+            <wp:extent cx="5943600" cy="2466975"/>
+            <wp:effectExtent t="0" r="0" b="0" l="0"/>
+            <wp:docPr id="1" name="prueba_ana_crm.png" descr="Captura de la terminal de MySQL con la sesión de ana_crm: consultas permitidas y errores 1142 al consultar campania y borrar en cliente." title="Pruebas de permisos con el usuario ana_crm"/>
+            <wp:cNvGraphicFramePr>
+              <a:graphicFrameLocks xmlns:a="http://schemas.openxmlformats.org/drawingml/2006/main" noChangeAspect="1"/>
+            </wp:cNvGraphicFramePr>
+            <a:graphic xmlns:a="http://schemas.openxmlformats.org/drawingml/2006/main">
+              <a:graphicData uri="http://schemas.openxmlformats.org/drawingml/2006/picture">
+                <pic:pic xmlns:pic="http://schemas.openxmlformats.org/drawingml/2006/picture">
+                  <pic:nvPicPr>
+                    <pic:cNvPr id="0" name="" descr=""/>
+                    <pic:cNvPicPr>
+                      <a:picLocks noChangeAspect="1" noChangeArrowheads="1"/>
+                    </pic:cNvPicPr>
+                  </pic:nvPicPr>
+                  <pic:blipFill>
+                    <a:blip r:embed="rId8" cstate="none"/>
+                    <a:srcRect/>
+                    <a:stretch>
+                      <a:fillRect/>
+                    </a:stretch>
+                  </pic:blipFill>
+                  <pic:spPr bwMode="auto">
+                    <a:xfrm>
+                      <a:off x="0" y="0"/>
+                      <a:ext cx="5943600" cy="2466975"/>
+                    </a:xfrm>
+                    <a:prstGeom prst="rect">
+                      <a:avLst/>
+                    </a:prstGeom>
+                  </pic:spPr>
+                </pic:pic>
+              </a:graphicData>
+            </a:graphic>
+          </wp:inline>
+        </w:drawing>
+      </w:r>
+    </w:p>
+    <w:p>
+      <w:pPr>
+        <w:spacing w:after="240" w:before="0" w:line="240"/>
+      </w:pPr>
+      <w:r>
+        <w:rPr>
+          <w:rFonts w:ascii="Times New Roman" w:cs="Times New Roman" w:eastAsia="Times New Roman" w:hAnsi="Times New Roman"/>
+          <w:i/>
+          <w:iCs/>
+          <w:sz w:val="22"/>
+          <w:szCs w:val="22"/>
+        </w:rPr>
+        <w:t xml:space="preserve">Nota. </w:t>
+      </w:r>
+      <w:r>
+        <w:rPr>
+          <w:rFonts w:ascii="Times New Roman" w:cs="Times New Roman" w:eastAsia="Times New Roman" w:hAnsi="Times New Roman"/>
+          <w:sz w:val="22"/>
+          <w:szCs w:val="22"/>
+        </w:rPr>
+        <w:t xml:space="preserve">La línea con el error 1064 corresponde a un error de digitación del comando (ELECT en lugar de SELECT) y no a una restricción de permisos; el comando se repitió correctamente al final de la sesión.</w:t>
+      </w:r>
+    </w:p>
+    <w:p>
+      <w:pPr>
+        <w:spacing w:after="0" w:before="0" w:line="480"/>
+        <w:ind w:firstLine="720"/>
+      </w:pPr>
+      <w:r>
+        <w:rPr>
+          <w:rFonts w:ascii="Times New Roman" w:cs="Times New Roman" w:eastAsia="Times New Roman" w:hAnsi="Times New Roman"/>
+          <w:sz w:val="24"/>
+          <w:szCs w:val="24"/>
+        </w:rPr>
+        <w:t xml:space="preserve">La Figura 2 corresponde a pedro_mkt. Puede consultar cliente, pero el intento de actualizarla es denegado con el error 1142, mientras que la actualización sobre campania se acepta. La lectura de conversion también es denegada, ya que esa tabla no forma parte de su rol.</w:t>
+      </w:r>
+    </w:p>
+    <w:p>
+      <w:pPr>
+        <w:keepNext/>
+        <w:spacing w:after="0" w:before="240" w:line="240"/>
+      </w:pPr>
+      <w:r>
+        <w:rPr>
+          <w:rFonts w:ascii="Times New Roman" w:cs="Times New Roman" w:eastAsia="Times New Roman" w:hAnsi="Times New Roman"/>
+          <w:b/>
+          <w:bCs/>
+          <w:sz w:val="24"/>
+          <w:szCs w:val="24"/>
+        </w:rPr>
+        <w:t xml:space="preserve">Figura 2</w:t>
+      </w:r>
+    </w:p>
+    <w:p>
+      <w:pPr>
+        <w:keepNext/>
+        <w:spacing w:after="120" w:before="0" w:line="240"/>
+      </w:pPr>
+      <w:r>
+        <w:rPr>
+          <w:rFonts w:ascii="Times New Roman" w:cs="Times New Roman" w:eastAsia="Times New Roman" w:hAnsi="Times New Roman"/>
+          <w:i/>
+          <w:iCs/>
+          <w:sz w:val="24"/>
+          <w:szCs w:val="24"/>
+        </w:rPr>
+        <w:t xml:space="preserve">Pruebas de permisos con el usuario pedro_mkt</w:t>
+      </w:r>
+    </w:p>
+    <w:p>
+      <w:pPr>
+        <w:keepNext/>
+        <w:spacing w:after="120" w:before="0" w:line="240" w:lineRule="auto"/>
+        <w:jc w:val="center"/>
+      </w:pPr>
+      <w:r>
+        <w:drawing>
+          <wp:inline distT="0" distB="0" distL="0" distR="0">
+            <wp:extent cx="5943600" cy="2457450"/>
+            <wp:effectExtent t="0" r="0" b="0" l="0"/>
+            <wp:docPr id="1" name="prueba_pedro_mkt.png" descr="Captura de la terminal de MySQL con la sesión de pedro_mkt: lectura de cliente permitida, actualización de cliente denegada, actualización de campania permitida y lectura de conversion denegada." title="Pruebas de permisos con el usuario pedro_mkt"/>
+            <wp:cNvGraphicFramePr>
+              <a:graphicFrameLocks xmlns:a="http://schemas.openxmlformats.org/drawingml/2006/main" noChangeAspect="1"/>
+            </wp:cNvGraphicFramePr>
+            <a:graphic xmlns:a="http://schemas.openxmlformats.org/drawingml/2006/main">
+              <a:graphicData uri="http://schemas.openxmlformats.org/drawingml/2006/picture">
+                <pic:pic xmlns:pic="http://schemas.openxmlformats.org/drawingml/2006/picture">
+                  <pic:nvPicPr>
+                    <pic:cNvPr id="0" name="" descr=""/>
+                    <pic:cNvPicPr>
+                      <a:picLocks noChangeAspect="1" noChangeArrowheads="1"/>
+                    </pic:cNvPicPr>
+                  </pic:nvPicPr>
+                  <pic:blipFill>
+                    <a:blip r:embed="rId9" cstate="none"/>
+                    <a:srcRect/>
+                    <a:stretch>
+                      <a:fillRect/>
+                    </a:stretch>
+                  </pic:blipFill>
+                  <pic:spPr bwMode="auto">
+                    <a:xfrm>
+                      <a:off x="0" y="0"/>
+                      <a:ext cx="5943600" cy="2457450"/>
+                    </a:xfrm>
+                    <a:prstGeom prst="rect">
+                      <a:avLst/>
+                    </a:prstGeom>
+                  </pic:spPr>
+                </pic:pic>
+              </a:graphicData>
+            </a:graphic>
+          </wp:inline>
+        </w:drawing>
+      </w:r>
+    </w:p>
+    <w:p>
+      <w:pPr>
+        <w:spacing w:after="240" w:before="0" w:line="240"/>
+      </w:pPr>
+      <w:r>
+        <w:rPr>
+          <w:rFonts w:ascii="Times New Roman" w:cs="Times New Roman" w:eastAsia="Times New Roman" w:hAnsi="Times New Roman"/>
+          <w:i/>
+          <w:iCs/>
+          <w:sz w:val="22"/>
+          <w:szCs w:val="22"/>
+        </w:rPr>
+        <w:t xml:space="preserve">Nota. </w:t>
+      </w:r>
+      <w:r>
+        <w:rPr>
+          <w:rFonts w:ascii="Times New Roman" w:cs="Times New Roman" w:eastAsia="Times New Roman" w:hAnsi="Times New Roman"/>
+          <w:sz w:val="22"/>
+          <w:szCs w:val="22"/>
+        </w:rPr>
+        <w:t xml:space="preserve">La línea con el error 1064 corresponde a un error de digitación (PDATE en lugar de UPDATE) y no a una restricción de permisos; el comando se repitió correctamente en la línea siguiente.</w:t>
+      </w:r>
+    </w:p>
+    <w:p>
+      <w:pPr>
+        <w:spacing w:after="0" w:before="0" w:line="480"/>
+        <w:ind w:firstLine="720"/>
+      </w:pPr>
+      <w:r>
+        <w:rPr>
+          <w:rFonts w:ascii="Times New Roman" w:cs="Times New Roman" w:eastAsia="Times New Roman" w:hAnsi="Times New Roman"/>
+          <w:sz w:val="24"/>
+          <w:szCs w:val="24"/>
+        </w:rPr>
+        <w:t xml:space="preserve">La Figura 3 muestra la sesión de marta_auditoria. Puede leer la tabla conversion y ejecutar el procedimiento almacenado sp_conversiones_por_tipo, pero la lectura de cliente y la inserción en conversion son rechazadas con el error 1142. Con ello se comprueba que el rol de auditoría solo dispone de consulta.</w:t>
+      </w:r>
+    </w:p>
+    <w:p>
+      <w:pPr>
+        <w:keepNext/>
+        <w:spacing w:after="0" w:before="240" w:line="240"/>
+      </w:pPr>
+      <w:r>
+        <w:rPr>
+          <w:rFonts w:ascii="Times New Roman" w:cs="Times New Roman" w:eastAsia="Times New Roman" w:hAnsi="Times New Roman"/>
+          <w:b/>
+          <w:bCs/>
+          <w:sz w:val="24"/>
+          <w:szCs w:val="24"/>
+        </w:rPr>
+        <w:t xml:space="preserve">Figura 3</w:t>
+      </w:r>
+    </w:p>
+    <w:p>
+      <w:pPr>
+        <w:keepNext/>
+        <w:spacing w:after="120" w:before="0" w:line="240"/>
+      </w:pPr>
+      <w:r>
+        <w:rPr>
+          <w:rFonts w:ascii="Times New Roman" w:cs="Times New Roman" w:eastAsia="Times New Roman" w:hAnsi="Times New Roman"/>
+          <w:i/>
+          <w:iCs/>
+          <w:sz w:val="24"/>
+          <w:szCs w:val="24"/>
+        </w:rPr>
+        <w:t xml:space="preserve">Pruebas de permisos con el usuario marta_auditoria</w:t>
+      </w:r>
+    </w:p>
+    <w:p>
+      <w:pPr>
+        <w:keepNext/>
+        <w:spacing w:after="120" w:before="0" w:line="240" w:lineRule="auto"/>
+        <w:jc w:val="center"/>
+      </w:pPr>
+      <w:r>
+        <w:drawing>
+          <wp:inline distT="0" distB="0" distL="0" distR="0">
+            <wp:extent cx="5943600" cy="3914775"/>
+            <wp:effectExtent t="0" r="0" b="0" l="0"/>
+            <wp:docPr id="1" name="prueba_marta_auditoria.png" descr="Captura de la terminal de MySQL con la sesión de marta_auditoria: lectura de conversion y ejecución del procedimiento permitidas, lectura de cliente e inserción en conversion denegadas." title="Pruebas de permisos con el usuario marta_auditoria"/>
+            <wp:cNvGraphicFramePr>
+              <a:graphicFrameLocks xmlns:a="http://schemas.openxmlformats.org/drawingml/2006/main" noChangeAspect="1"/>
+            </wp:cNvGraphicFramePr>
+            <a:graphic xmlns:a="http://schemas.openxmlformats.org/drawingml/2006/main">
+              <a:graphicData uri="http://schemas.openxmlformats.org/drawingml/2006/picture">
+                <pic:pic xmlns:pic="http://schemas.openxmlformats.org/drawingml/2006/picture">
+                  <pic:nvPicPr>
+                    <pic:cNvPr id="0" name="" descr=""/>
+                    <pic:cNvPicPr>
+                      <a:picLocks noChangeAspect="1" noChangeArrowheads="1"/>
+                    </pic:cNvPicPr>
+                  </pic:nvPicPr>
+                  <pic:blipFill>
+                    <a:blip r:embed="rId10" cstate="none"/>
+                    <a:srcRect/>
+                    <a:stretch>
+                      <a:fillRect/>
+                    </a:stretch>
+                  </pic:blipFill>
+                  <pic:spPr bwMode="auto">
+                    <a:xfrm>
+                      <a:off x="0" y="0"/>
+                      <a:ext cx="5943600" cy="3914775"/>
+                    </a:xfrm>
+                    <a:prstGeom prst="rect">
+                      <a:avLst/>
+                    </a:prstGeom>
+                  </pic:spPr>
+                </pic:pic>
+              </a:graphicData>
+            </a:graphic>
+          </wp:inline>
+        </w:drawing>
+      </w:r>
+    </w:p>
+    <w:p>
+      <w:pPr>
+        <w:spacing w:after="240" w:before="0" w:line="240"/>
+      </w:pPr>
+      <w:r>
+        <w:rPr>
+          <w:rFonts w:ascii="Times New Roman" w:cs="Times New Roman" w:eastAsia="Times New Roman" w:hAnsi="Times New Roman"/>
+          <w:i/>
+          <w:iCs/>
+          <w:sz w:val="22"/>
+          <w:szCs w:val="22"/>
+        </w:rPr>
+        <w:t xml:space="preserve">Nota. </w:t>
+      </w:r>
+      <w:r>
+        <w:rPr>
+          <w:rFonts w:ascii="Times New Roman" w:cs="Times New Roman" w:eastAsia="Times New Roman" w:hAnsi="Times New Roman"/>
+          <w:sz w:val="22"/>
+          <w:szCs w:val="22"/>
+        </w:rPr>
+        <w:t xml:space="preserve">Los valores que aparecen en las consultas corresponden a los datos cargados en la base de datos en el momento de la prueba.</w:t>
+      </w:r>
+    </w:p>
+    <w:p>
+      <w:pPr>
+        <w:pStyle w:val="Heading1"/>
+        <w:spacing w:after="0" w:before="0" w:line="480"/>
+        <w:jc w:val="center"/>
+      </w:pPr>
+      <w:r>
+        <w:rPr>
+          <w:rFonts w:ascii="Times New Roman" w:cs="Times New Roman" w:eastAsia="Times New Roman" w:hAnsi="Times New Roman"/>
+          <w:b/>
+          <w:bCs/>
+          <w:sz w:val="24"/>
+          <w:szCs w:val="24"/>
+        </w:rPr>
         <w:t xml:space="preserve">Conclusión</w:t>
       </w:r>
     </w:p>
@@ -5948,7 +6353,7 @@
           <w:sz w:val="24"/>
           <w:szCs w:val="24"/>
         </w:rPr>
-        <w:t xml:space="preserve">La configuración realizada separa las responsabilidades de las tres áreas de la empresa y limita el acceso de cada una a los datos que necesita. El uso de roles simplifica la administración, porque un cambio de permisos se hace una vez y alcanza a todas las cuentas que comparten el rol. La decisión de no conceder DELETE, permisos de estructura ni GRANT OPTION reduce el daño que podría causar un error o una cuenta comprometida.</w:t>
+        <w:t xml:space="preserve">La configuración realizada separa las responsabilidades de las tres áreas de la empresa y limita el acceso de cada una a los datos que necesita. El uso de roles simplifica la administración, porque un cambio de permisos se hace una vez y alcanza a todas las cuentas que comparten el rol. La decisión de no conceder DELETE, permisos de estructura ni GRANT OPTION reduce el daño que podría causar un error o una cuenta comprometida. Las pruebas realizadas con cada usuario confirmaron que las operaciones permitidas funcionan y que las no autorizadas son rechazadas por el servidor con el error 1142.</w:t>
       </w:r>
     </w:p>
     <w:p>

</xml_diff>

<commit_message>
Actualiza documento tecnico con portada y correcciones APA
</commit_message>
<xml_diff>
--- a/docs/Documento_Tecnico_Empresa_Retail.docx
+++ b/docs/Documento_Tecnico_Empresa_Retail.docx
@@ -70,7 +70,7 @@
           <w:sz w:val="24"/>
           <w:szCs w:val="24"/>
         </w:rPr>
-        <w:t xml:space="preserve">[Nombre completo del estudiante]</w:t>
+        <w:t xml:space="preserve">Sebastian Lopez Garcia</w:t>
       </w:r>
     </w:p>
     <w:p>
@@ -84,7 +84,7 @@
           <w:sz w:val="24"/>
           <w:szCs w:val="24"/>
         </w:rPr>
-        <w:t xml:space="preserve">[Programa académico]</w:t>
+        <w:t xml:space="preserve">Ingenieria de sistemas</w:t>
       </w:r>
     </w:p>
     <w:p>
@@ -98,7 +98,7 @@
           <w:sz w:val="24"/>
           <w:szCs w:val="24"/>
         </w:rPr>
-        <w:t xml:space="preserve">[Institución educativa]</w:t>
+        <w:t xml:space="preserve">Fundacion Universitaria De Popayan</w:t>
       </w:r>
     </w:p>
     <w:p>
@@ -112,7 +112,7 @@
           <w:sz w:val="24"/>
           <w:szCs w:val="24"/>
         </w:rPr>
-        <w:t xml:space="preserve">[Nombre del curso]</w:t>
+        <w:t xml:space="preserve">Administracion De Base De Datos</w:t>
       </w:r>
     </w:p>
     <w:p>
@@ -126,7 +126,7 @@
           <w:sz w:val="24"/>
           <w:szCs w:val="24"/>
         </w:rPr>
-        <w:t xml:space="preserve">[Nombre del docente]</w:t>
+        <w:t xml:space="preserve">Luis Vejarano</w:t>
       </w:r>
     </w:p>
     <w:p>
@@ -343,7 +343,7 @@
           <w:szCs w:val="24"/>
         </w:rPr>
         <w:tab/>
-        <w:t xml:space="preserve">7</w:t>
+        <w:t xml:space="preserve">8</w:t>
       </w:r>
     </w:p>
     <w:p>
@@ -457,7 +457,6 @@
     </w:p>
     <w:p>
       <w:pPr>
-        <w:pStyle w:val="Heading1"/>
         <w:spacing w:after="0" w:before="0" w:line="480"/>
         <w:jc w:val="center"/>
       </w:pPr>
@@ -469,49 +468,7 @@
           <w:sz w:val="24"/>
           <w:szCs w:val="24"/>
         </w:rPr>
-        <w:t xml:space="preserve">Introducción</w:t>
-      </w:r>
-    </w:p>
-    <w:p>
-      <w:pPr>
-        <w:spacing w:after="0" w:before="0" w:line="480"/>
-        <w:ind w:firstLine="720"/>
-      </w:pPr>
-      <w:r>
-        <w:rPr>
-          <w:rFonts w:ascii="Times New Roman" w:cs="Times New Roman" w:eastAsia="Times New Roman" w:hAnsi="Times New Roman"/>
-          <w:sz w:val="24"/>
-          <w:szCs w:val="24"/>
-        </w:rPr>
-        <w:t xml:space="preserve">La seguridad de una base de datos no depende únicamente de proteger el servidor frente a ataques externos; también exige controlar qué puede hacer cada persona que accede legítimamente a la información. En una empresa de comercio minorista, distintas áreas consultan y modifican los mismos datos, y un permiso excesivo en manos equivocadas puede producir desde errores accidentales hasta fugas de información sensibles.</w:t>
-      </w:r>
-    </w:p>
-    <w:p>
-      <w:pPr>
-        <w:spacing w:after="0" w:before="0" w:line="480"/>
-        <w:ind w:firstLine="720"/>
-      </w:pPr>
-      <w:r>
-        <w:rPr>
-          <w:rFonts w:ascii="Times New Roman" w:cs="Times New Roman" w:eastAsia="Times New Roman" w:hAnsi="Times New Roman"/>
-          <w:sz w:val="24"/>
-          <w:szCs w:val="24"/>
-        </w:rPr>
-        <w:t xml:space="preserve">Este documento describe la configuración de seguridad de la base de datos empresa-retail-db, implementada en MySQL 8, para separar las responsabilidades de tres perfiles de trabajo: la persona encargada de la atención y gestión de clientes (Cajas), la persona que administra canales y campañas (Inventario y marketing) y la persona de auditoría y gerencia. Para ello se aplica el principio de mínimo privilegio, según el cual cada usuario debe disponer únicamente de los permisos indispensables para cumplir su función (Saltzer &amp; Schroeder, 1975).</w:t>
-      </w:r>
-    </w:p>
-    <w:p>
-      <w:pPr>
-        <w:spacing w:after="0" w:before="0" w:line="480"/>
-        <w:ind w:firstLine="720"/>
-      </w:pPr>
-      <w:r>
-        <w:rPr>
-          <w:rFonts w:ascii="Times New Roman" w:cs="Times New Roman" w:eastAsia="Times New Roman" w:hAnsi="Times New Roman"/>
-          <w:sz w:val="24"/>
-          <w:szCs w:val="24"/>
-        </w:rPr>
-        <w:t xml:space="preserve">El trabajo incluye la creación del repositorio de control de versiones empresa-retail-admin, la construcción del esquema de datos a partir del modelo entidad-relación suministrado, la definición de roles y usuarios, la asignación de permisos y la creación de procedimientos almacenados de consulta para el rol de auditoría. La solución se encuentra en la rama develop del repositorio.</w:t>
+        <w:t xml:space="preserve">Configuración de la seguridad de la base de datos “empresa-retail-db”: usuarios, roles y permisos por área de trabajo</w:t>
       </w:r>
     </w:p>
     <w:p>
@@ -528,14 +485,56 @@
           <w:sz w:val="24"/>
           <w:szCs w:val="24"/>
         </w:rPr>
-        <w:t xml:space="preserve">Desarrollo de la actividad</w:t>
-      </w:r>
-    </w:p>
-    <w:p>
-      <w:pPr>
-        <w:pStyle w:val="Heading2"/>
-        <w:spacing w:after="0" w:before="0" w:line="480"/>
-        <w:jc w:val="left"/>
+        <w:t xml:space="preserve">Introducción</w:t>
+      </w:r>
+    </w:p>
+    <w:p>
+      <w:pPr>
+        <w:spacing w:after="0" w:before="0" w:line="480"/>
+        <w:ind w:firstLine="720"/>
+      </w:pPr>
+      <w:r>
+        <w:rPr>
+          <w:rFonts w:ascii="Times New Roman" w:cs="Times New Roman" w:eastAsia="Times New Roman" w:hAnsi="Times New Roman"/>
+          <w:sz w:val="24"/>
+          <w:szCs w:val="24"/>
+        </w:rPr>
+        <w:t xml:space="preserve">La seguridad de una base de datos no depende únicamente de proteger el servidor frente a ataques externos; también exige controlar qué puede hacer cada persona que accede legítimamente a la información. En una empresa de comercio minorista, distintas áreas consultan y modifican los mismos datos, y un permiso excesivo en manos equivocadas puede producir desde errores accidentales hasta fugas de información sensibles.</w:t>
+      </w:r>
+    </w:p>
+    <w:p>
+      <w:pPr>
+        <w:spacing w:after="0" w:before="0" w:line="480"/>
+        <w:ind w:firstLine="720"/>
+      </w:pPr>
+      <w:r>
+        <w:rPr>
+          <w:rFonts w:ascii="Times New Roman" w:cs="Times New Roman" w:eastAsia="Times New Roman" w:hAnsi="Times New Roman"/>
+          <w:sz w:val="24"/>
+          <w:szCs w:val="24"/>
+        </w:rPr>
+        <w:t xml:space="preserve">Este documento describe la configuración de seguridad de la base de datos empresa-retail-db, implementada en MySQL 8, para separar las responsabilidades de tres perfiles de trabajo: la persona encargada de la atención y gestión de clientes (Cajas), la persona que administra canales y campañas (Inventario y marketing) y la persona de auditoría y gerencia. Para ello se aplica el principio de mínimo privilegio, según el cual cada usuario debe disponer únicamente de los permisos indispensables para cumplir su función (Saltzer y Schroeder, 1975).</w:t>
+      </w:r>
+    </w:p>
+    <w:p>
+      <w:pPr>
+        <w:spacing w:after="0" w:before="0" w:line="480"/>
+        <w:ind w:firstLine="720"/>
+      </w:pPr>
+      <w:r>
+        <w:rPr>
+          <w:rFonts w:ascii="Times New Roman" w:cs="Times New Roman" w:eastAsia="Times New Roman" w:hAnsi="Times New Roman"/>
+          <w:sz w:val="24"/>
+          <w:szCs w:val="24"/>
+        </w:rPr>
+        <w:t xml:space="preserve">El trabajo incluye la creación del repositorio de control de versiones empresa-retail-admin, la construcción del esquema de datos a partir del modelo entidad-relación suministrado, la definición de roles y usuarios, la asignación de permisos y la creación de procedimientos almacenados de consulta para el rol de auditoría. La solución se encuentra en la rama develop del repositorio. Para la redacción y el formato de este documento se siguieron las normas de la séptima edición del Manual de publicaciones de la American Psychological Association (American Psychological Association, 2020).</w:t>
+      </w:r>
+    </w:p>
+    <w:p>
+      <w:pPr>
+        <w:pStyle w:val="Heading1"/>
+        <w:spacing w:after="0" w:before="0" w:line="480"/>
+        <w:jc w:val="center"/>
       </w:pPr>
       <w:r>
         <w:rPr>
@@ -545,6 +544,23 @@
           <w:sz w:val="24"/>
           <w:szCs w:val="24"/>
         </w:rPr>
+        <w:t xml:space="preserve">Desarrollo de la actividad</w:t>
+      </w:r>
+    </w:p>
+    <w:p>
+      <w:pPr>
+        <w:pStyle w:val="Heading2"/>
+        <w:spacing w:after="0" w:before="0" w:line="480"/>
+        <w:jc w:val="left"/>
+      </w:pPr>
+      <w:r>
+        <w:rPr>
+          <w:rFonts w:ascii="Times New Roman" w:cs="Times New Roman" w:eastAsia="Times New Roman" w:hAnsi="Times New Roman"/>
+          <w:b/>
+          <w:bCs/>
+          <w:sz w:val="24"/>
+          <w:szCs w:val="24"/>
+        </w:rPr>
         <w:t xml:space="preserve">Repositorio y control de versiones</w:t>
       </w:r>
     </w:p>
@@ -559,7 +575,7 @@
           <w:sz w:val="24"/>
           <w:szCs w:val="24"/>
         </w:rPr>
-        <w:t xml:space="preserve">Se creó el repositorio empresa-retail-admin con dos ramas: main, que representa la versión estable, y develop, donde se desarrolló y quedó almacenada la solución de la actividad. Esta organización sigue el flujo de trabajo habitual en Git, en el que el trabajo en curso se integra primero en una rama de desarrollo antes de pasar a la rama principal (Chacon &amp; Straub, 2014). Además, se incluyó un archivo README.md con la descripción del proyecto y un archivo .gitignore orientado a proyectos SQL, que excluye respaldos, volcados de datos, registros y archivos de credenciales.</w:t>
+        <w:t xml:space="preserve">Se creó el repositorio empresa-retail-admin con dos ramas: main, que representa la versión estable, y develop, donde se desarrolló y quedó almacenada la solución de la actividad. Esta organización sigue el flujo de trabajo habitual en Git, en el que el trabajo en curso se integra primero en una rama de desarrollo antes de pasar a la rama principal (Chacon y Straub, 2014). Además, se incluyó un archivo README.md con la descripción del proyecto y un archivo .gitignore orientado a proyectos SQL, que excluye respaldos, volcados de datos, registros y archivos de credenciales. La Tabla 1 resume la estructura final del repositorio.</w:t>
       </w:r>
     </w:p>
     <w:p>
@@ -1334,7 +1350,7 @@
           <w:sz w:val="24"/>
           <w:szCs w:val="24"/>
         </w:rPr>
-        <w:t xml:space="preserve">El esquema se construyó a partir del modelo entidad-relación empresa-retail-bd.mwb, elaborado en MySQL Workbench, que define la base de datos empresa-retail-db con cinco tablas: cliente, canal, campania, interaccion y conversion. Cada campaña pertenece a un canal; cada interacción (clic, visita, comentario o descarga) relaciona a un cliente con una campaña; y cada conversión (compra, registro o suscripción) se asocia a un cliente. Como el nombre de la base de datos contiene guiones, en las sentencias SQL se escribe entre comillas invertidas.</w:t>
+        <w:t xml:space="preserve">El esquema se construyó a partir del modelo entidad-relación empresa-retail-bd.mwb, elaborado en MySQL Workbench, que define la base de datos empresa-retail-db con cinco tablas: cliente, canal, campania, interaccion y conversion. Cada campaña pertenece a un canal; cada interacción (clic, visita, comentario o descarga) relaciona a un cliente con una campaña; y cada conversión (compra, registro o suscripción) se asocia a un cliente. Como el nombre de la base de datos contiene guiones, en las sentencias SQL se escribe entre comillas invertidas. La Tabla 2 describe el contenido de cada tabla.</w:t>
       </w:r>
     </w:p>
     <w:p>
@@ -2053,7 +2069,7 @@
           <w:sz w:val="24"/>
           <w:szCs w:val="24"/>
         </w:rPr>
-        <w:t xml:space="preserve">En MySQL 8 un rol es un conjunto con nombre de privilegios que puede asignarse a varias cuentas (Oracle Corporation, s. f.-a). Se creó un rol por cada perfil de trabajo, de modo que los permisos se administran en un solo lugar y no cuenta por cuenta. Cada usuario recibe su rol y este se activa por defecto al iniciar sesión.</w:t>
+        <w:t xml:space="preserve">En MySQL 8 un rol es un conjunto con nombre de privilegios que puede asignarse a varias cuentas (Oracle Corporation, s. f.-a). Se creó un rol por cada perfil de trabajo, de modo que los permisos se administran en un solo lugar y no cuenta por cuenta. Cada usuario recibe su rol y este se activa por defecto al iniciar sesión. La Tabla 3 relaciona cada usuario con su rol y su área de trabajo.</w:t>
       </w:r>
     </w:p>
     <w:p>
@@ -2988,7 +3004,7 @@
           <w:sz w:val="24"/>
           <w:szCs w:val="24"/>
         </w:rPr>
-        <w:t xml:space="preserve">Los permisos se otorgaron con la sentencia GRANT sobre cada rol (Oracle Corporation, s. f.-b). Ningún rol recibió DELETE, privilegios de definición de datos (CREATE, ALTER, DROP) ni la opción GRANT OPTION, de manera que ninguna persona puede borrar registros, modificar la estructura de la base de datos ni delegar permisos a otras cuentas.</w:t>
+        <w:t xml:space="preserve">Los permisos se otorgaron con la sentencia GRANT sobre cada rol (Oracle Corporation, s. f.-b). Ningún rol recibió DELETE, privilegios de definición de datos (CREATE, ALTER, DROP) ni la opción GRANT OPTION, de manera que ninguna persona puede borrar registros, modificar la estructura de la base de datos ni delegar permisos a otras cuentas. La Tabla 4 resume los privilegios de cada rol sobre cada objeto de la base de datos.</w:t>
       </w:r>
     </w:p>
     <w:p>
@@ -6435,7 +6451,7 @@
           <w:sz w:val="24"/>
           <w:szCs w:val="24"/>
         </w:rPr>
-        <w:t xml:space="preserve">Chacon, S., &amp; Straub, B. (2014). </w:t>
+        <w:t xml:space="preserve">Chacon, S., y Straub, B. (2014). </w:t>
       </w:r>
       <w:r>
         <w:rPr>
@@ -6563,7 +6579,7 @@
           <w:sz w:val="24"/>
           <w:szCs w:val="24"/>
         </w:rPr>
-        <w:t xml:space="preserve">Saltzer, J. H., &amp; Schroeder, M. D. (1975). The protection of information in computer systems. </w:t>
+        <w:t xml:space="preserve">Saltzer, J. H., y Schroeder, M. D. (1975). The protection of information in computer systems. </w:t>
       </w:r>
       <w:r>
         <w:rPr>

</xml_diff>